<commit_message>
fix error and update formatting in FOC10 attachment template
</commit_message>
<xml_diff>
--- a/docassemble/MLHDivorceAndCustody/data/templates/child_support_foc_10_attachment.docx
+++ b/docassemble/MLHDivorceAndCustody/data/templates/child_support_foc_10_attachment.docx
@@ -18,18 +18,50 @@
         </w:rPr>
         <w:t xml:space="preserve">{%p if </w:t>
       </w:r>
-      <w:r>
-        <w:rPr>
-          <w:rFonts w:ascii="Arial" w:hAnsi="Arial" w:cs="Arial"/>
-        </w:rPr>
-        <w:t>children.filter(legal_parent="both")</w:t>
-      </w:r>
-      <w:r>
-        <w:rPr>
-          <w:rFonts w:ascii="Arial" w:hAnsi="Arial" w:cs="Arial"/>
-        </w:rPr>
-        <w:t xml:space="preserve"> | length &gt; 5 %}</w:t>
-      </w:r>
+      <w:proofErr w:type="spellStart"/>
+      <w:proofErr w:type="gramStart"/>
+      <w:r>
+        <w:rPr>
+          <w:rFonts w:ascii="Arial" w:hAnsi="Arial" w:cs="Arial"/>
+        </w:rPr>
+        <w:t>children.filter</w:t>
+      </w:r>
+      <w:proofErr w:type="spellEnd"/>
+      <w:proofErr w:type="gramEnd"/>
+      <w:r>
+        <w:rPr>
+          <w:rFonts w:ascii="Arial" w:hAnsi="Arial" w:cs="Arial"/>
+        </w:rPr>
+        <w:t>(</w:t>
+      </w:r>
+      <w:proofErr w:type="spellStart"/>
+      <w:r>
+        <w:rPr>
+          <w:rFonts w:ascii="Arial" w:hAnsi="Arial" w:cs="Arial"/>
+        </w:rPr>
+        <w:t>legal_parent</w:t>
+      </w:r>
+      <w:proofErr w:type="spellEnd"/>
+      <w:r>
+        <w:rPr>
+          <w:rFonts w:ascii="Arial" w:hAnsi="Arial" w:cs="Arial"/>
+        </w:rPr>
+        <w:t>="both")</w:t>
+      </w:r>
+      <w:r>
+        <w:rPr>
+          <w:rFonts w:ascii="Arial" w:hAnsi="Arial" w:cs="Arial"/>
+        </w:rPr>
+        <w:t xml:space="preserve"> | length &gt; </w:t>
+      </w:r>
+      <w:proofErr w:type="gramStart"/>
+      <w:r>
+        <w:rPr>
+          <w:rFonts w:ascii="Arial" w:hAnsi="Arial" w:cs="Arial"/>
+        </w:rPr>
+        <w:t>5 %}</w:t>
+      </w:r>
+      <w:proofErr w:type="gramEnd"/>
     </w:p>
     <w:p>
       <w:pPr>
@@ -56,7 +88,15 @@
           <w:b/>
           <w:bCs/>
         </w:rPr>
-        <w:t xml:space="preserve"> from 2a.</w:t>
+        <w:t xml:space="preserve"> from 2</w:t>
+      </w:r>
+      <w:r>
+        <w:rPr>
+          <w:rFonts w:ascii="Arial" w:hAnsi="Arial" w:cs="Arial"/>
+          <w:b/>
+          <w:bCs/>
+        </w:rPr>
+        <w:t>a:</w:t>
       </w:r>
     </w:p>
     <w:p>
@@ -88,20 +128,56 @@
         </w:rPr>
         <w:t xml:space="preserve">child in </w:t>
       </w:r>
+      <w:proofErr w:type="spellStart"/>
+      <w:proofErr w:type="gramStart"/>
       <w:r>
         <w:rPr>
           <w:rFonts w:ascii="Arial" w:hAnsi="Arial" w:cs="Arial"/>
           <w:highlight w:val="cyan"/>
         </w:rPr>
-        <w:t>children.filter(legal_parent="both")</w:t>
-      </w:r>
+        <w:t>children.filter</w:t>
+      </w:r>
+      <w:proofErr w:type="spellEnd"/>
+      <w:proofErr w:type="gramEnd"/>
       <w:r>
         <w:rPr>
           <w:rFonts w:ascii="Arial" w:hAnsi="Arial" w:cs="Arial"/>
           <w:highlight w:val="cyan"/>
         </w:rPr>
+        <w:t>(</w:t>
+      </w:r>
+      <w:proofErr w:type="spellStart"/>
+      <w:r>
+        <w:rPr>
+          <w:rFonts w:ascii="Arial" w:hAnsi="Arial" w:cs="Arial"/>
+          <w:highlight w:val="cyan"/>
+        </w:rPr>
+        <w:t>legal_parent</w:t>
+      </w:r>
+      <w:proofErr w:type="spellEnd"/>
+      <w:r>
+        <w:rPr>
+          <w:rFonts w:ascii="Arial" w:hAnsi="Arial" w:cs="Arial"/>
+          <w:highlight w:val="cyan"/>
+        </w:rPr>
+        <w:t>="both</w:t>
+      </w:r>
+      <w:proofErr w:type="gramStart"/>
+      <w:r>
+        <w:rPr>
+          <w:rFonts w:ascii="Arial" w:hAnsi="Arial" w:cs="Arial"/>
+          <w:highlight w:val="cyan"/>
+        </w:rPr>
+        <w:t>")</w:t>
+      </w:r>
+      <w:r>
+        <w:rPr>
+          <w:rFonts w:ascii="Arial" w:hAnsi="Arial" w:cs="Arial"/>
+          <w:highlight w:val="cyan"/>
+        </w:rPr>
         <w:t>[</w:t>
       </w:r>
+      <w:proofErr w:type="gramEnd"/>
       <w:r>
         <w:rPr>
           <w:rFonts w:ascii="Arial" w:hAnsi="Arial" w:cs="Arial"/>
@@ -114,13 +190,21 @@
           <w:rFonts w:ascii="Arial" w:hAnsi="Arial" w:cs="Arial"/>
           <w:highlight w:val="cyan"/>
         </w:rPr>
-        <w:t>:]</w:t>
-      </w:r>
+        <w:t>:</w:t>
+      </w:r>
+      <w:proofErr w:type="gramStart"/>
       <w:r>
         <w:rPr>
           <w:rFonts w:ascii="Arial" w:hAnsi="Arial" w:cs="Arial"/>
           <w:highlight w:val="cyan"/>
         </w:rPr>
+        <w:t>]</w:t>
+      </w:r>
+      <w:r>
+        <w:rPr>
+          <w:rFonts w:ascii="Arial" w:hAnsi="Arial" w:cs="Arial"/>
+          <w:highlight w:val="cyan"/>
+        </w:rPr>
         <w:t xml:space="preserve"> </w:t>
       </w:r>
       <w:r>
@@ -129,6 +213,7 @@
         </w:rPr>
         <w:t>%}</w:t>
       </w:r>
+      <w:proofErr w:type="gramEnd"/>
     </w:p>
     <w:p>
       <w:pPr>
@@ -139,24 +224,55 @@
           <w:rFonts w:ascii="Arial" w:hAnsi="Arial" w:cs="Arial"/>
         </w:rPr>
       </w:pPr>
-      <w:r>
-        <w:rPr>
-          <w:rFonts w:ascii="Arial" w:hAnsi="Arial" w:cs="Arial"/>
-        </w:rPr>
-        <w:t>{{ loop.index</w:t>
-      </w:r>
-      <w:r>
-        <w:rPr>
-          <w:rFonts w:ascii="Arial" w:hAnsi="Arial" w:cs="Arial"/>
-        </w:rPr>
-        <w:t xml:space="preserve"> + 5</w:t>
-      </w:r>
-      <w:r>
-        <w:rPr>
-          <w:rFonts w:ascii="Arial" w:hAnsi="Arial" w:cs="Arial"/>
-        </w:rPr>
-        <w:t xml:space="preserve"> }}. </w:t>
-      </w:r>
+      <w:proofErr w:type="gramStart"/>
+      <w:r>
+        <w:rPr>
+          <w:rFonts w:ascii="Arial" w:hAnsi="Arial" w:cs="Arial"/>
+        </w:rPr>
+        <w:t xml:space="preserve">{{ </w:t>
+      </w:r>
+      <w:proofErr w:type="spellStart"/>
+      <w:r>
+        <w:rPr>
+          <w:rFonts w:ascii="Arial" w:hAnsi="Arial" w:cs="Arial"/>
+        </w:rPr>
+        <w:t>loop</w:t>
+      </w:r>
+      <w:proofErr w:type="gramEnd"/>
+      <w:r>
+        <w:rPr>
+          <w:rFonts w:ascii="Arial" w:hAnsi="Arial" w:cs="Arial"/>
+        </w:rPr>
+        <w:t>.index</w:t>
+      </w:r>
+      <w:proofErr w:type="spellEnd"/>
+      <w:r>
+        <w:rPr>
+          <w:rFonts w:ascii="Arial" w:hAnsi="Arial" w:cs="Arial"/>
+        </w:rPr>
+        <w:t xml:space="preserve"> + </w:t>
+      </w:r>
+      <w:proofErr w:type="gramStart"/>
+      <w:r>
+        <w:rPr>
+          <w:rFonts w:ascii="Arial" w:hAnsi="Arial" w:cs="Arial"/>
+        </w:rPr>
+        <w:t>5</w:t>
+      </w:r>
+      <w:r>
+        <w:rPr>
+          <w:rFonts w:ascii="Arial" w:hAnsi="Arial" w:cs="Arial"/>
+        </w:rPr>
+        <w:t xml:space="preserve"> }</w:t>
+      </w:r>
+      <w:proofErr w:type="gramEnd"/>
+      <w:r>
+        <w:rPr>
+          <w:rFonts w:ascii="Arial" w:hAnsi="Arial" w:cs="Arial"/>
+        </w:rPr>
+        <w:t xml:space="preserve">}. </w:t>
+      </w:r>
+      <w:proofErr w:type="gramStart"/>
       <w:r>
         <w:rPr>
           <w:rFonts w:ascii="Arial" w:hAnsi="Arial" w:cs="Arial"/>
@@ -177,6 +293,7 @@
         </w:rPr>
         <w:t>child</w:t>
       </w:r>
+      <w:proofErr w:type="gramEnd"/>
       <w:r>
         <w:rPr>
           <w:rFonts w:ascii="Arial" w:hAnsi="Arial" w:cs="Arial"/>
@@ -194,7 +311,14 @@
         <w:rPr>
           <w:rFonts w:ascii="Arial" w:hAnsi="Arial" w:cs="Arial"/>
         </w:rPr>
-        <w:t xml:space="preserve"> -</w:t>
+        <w:t xml:space="preserve"> </w:t>
+      </w:r>
+      <w:proofErr w:type="gramStart"/>
+      <w:r>
+        <w:rPr>
+          <w:rFonts w:ascii="Arial" w:hAnsi="Arial" w:cs="Arial"/>
+        </w:rPr>
+        <w:t>-</w:t>
       </w:r>
       <w:r>
         <w:rPr>
@@ -206,13 +330,34 @@
         <w:rPr>
           <w:rFonts w:ascii="Arial" w:hAnsi="Arial" w:cs="Arial"/>
         </w:rPr>
-        <w:t>Annual o</w:t>
-      </w:r>
-      <w:r>
-        <w:rPr>
-          <w:rFonts w:ascii="Arial" w:hAnsi="Arial" w:cs="Arial"/>
-        </w:rPr>
-        <w:t>vernights with payer: ________</w:t>
+        <w:t>Annual</w:t>
+      </w:r>
+      <w:proofErr w:type="gramEnd"/>
+      <w:r>
+        <w:rPr>
+          <w:rFonts w:ascii="Arial" w:hAnsi="Arial" w:cs="Arial"/>
+        </w:rPr>
+        <w:t xml:space="preserve"> o</w:t>
+      </w:r>
+      <w:r>
+        <w:rPr>
+          <w:rFonts w:ascii="Arial" w:hAnsi="Arial" w:cs="Arial"/>
+        </w:rPr>
+        <w:t xml:space="preserve">vernights with </w:t>
+      </w:r>
+      <w:proofErr w:type="gramStart"/>
+      <w:r>
+        <w:rPr>
+          <w:rFonts w:ascii="Arial" w:hAnsi="Arial" w:cs="Arial"/>
+        </w:rPr>
+        <w:t>payer: _</w:t>
+      </w:r>
+      <w:proofErr w:type="gramEnd"/>
+      <w:r>
+        <w:rPr>
+          <w:rFonts w:ascii="Arial" w:hAnsi="Arial" w:cs="Arial"/>
+        </w:rPr>
+        <w:t>_______</w:t>
       </w:r>
     </w:p>
     <w:p>
@@ -236,7 +381,24 @@
           <w:rFonts w:ascii="Arial" w:hAnsi="Arial" w:cs="Arial"/>
           <w:highlight w:val="cyan"/>
         </w:rPr>
-        <w:t xml:space="preserve">p endfor </w:t>
+        <w:t xml:space="preserve">p </w:t>
+      </w:r>
+      <w:proofErr w:type="spellStart"/>
+      <w:proofErr w:type="gramStart"/>
+      <w:r>
+        <w:rPr>
+          <w:rFonts w:ascii="Arial" w:hAnsi="Arial" w:cs="Arial"/>
+          <w:highlight w:val="cyan"/>
+        </w:rPr>
+        <w:t>endfor</w:t>
+      </w:r>
+      <w:proofErr w:type="spellEnd"/>
+      <w:r>
+        <w:rPr>
+          <w:rFonts w:ascii="Arial" w:hAnsi="Arial" w:cs="Arial"/>
+          <w:highlight w:val="cyan"/>
+        </w:rPr>
+        <w:t xml:space="preserve"> </w:t>
       </w:r>
       <w:r>
         <w:rPr>
@@ -244,6 +406,7 @@
         </w:rPr>
         <w:t>%}</w:t>
       </w:r>
+      <w:proofErr w:type="gramEnd"/>
     </w:p>
     <w:p>
       <w:pPr>
@@ -260,8 +423,16 @@
         <w:rPr>
           <w:rFonts w:ascii="Arial" w:hAnsi="Arial" w:cs="Arial"/>
         </w:rPr>
-        <w:t>{%p endif %}</w:t>
-      </w:r>
+        <w:t xml:space="preserve">{%p </w:t>
+      </w:r>
+      <w:proofErr w:type="gramStart"/>
+      <w:r>
+        <w:rPr>
+          <w:rFonts w:ascii="Arial" w:hAnsi="Arial" w:cs="Arial"/>
+        </w:rPr>
+        <w:t>endif %}</w:t>
+      </w:r>
+      <w:proofErr w:type="gramEnd"/>
     </w:p>
     <w:sectPr>
       <w:headerReference w:type="even" r:id="rId7"/>
@@ -272,7 +443,7 @@
       <w:footerReference w:type="first" r:id="rId12"/>
       <w:pgSz w:w="12240" w:h="15840"/>
       <w:pgMar w:top="1497" w:right="1080" w:bottom="1440" w:left="1080" w:header="1440" w:footer="1008" w:gutter="0"/>
-      <w:pgNumType w:start="2"/>
+      <w:pgNumType w:start="1"/>
       <w:cols w:space="720"/>
       <w:formProt w:val="0"/>
       <w:docGrid w:linePitch="360" w:charSpace="4096"/>
@@ -324,71 +495,57 @@
       <w:spacing w:after="0"/>
       <w:jc w:val="center"/>
       <w:rPr>
-        <w:rFonts w:ascii="Helvetica" w:hAnsi="Helvetica" w:cs="Times New Roman"/>
+        <w:rFonts w:ascii="Arial" w:hAnsi="Arial" w:cs="Arial"/>
         <w:sz w:val="20"/>
         <w:szCs w:val="20"/>
       </w:rPr>
     </w:pPr>
     <w:r>
       <w:rPr>
-        <w:rFonts w:ascii="Helvetica" w:hAnsi="Helvetica" w:cs="Times New Roman"/>
-        <w:sz w:val="20"/>
-        <w:szCs w:val="20"/>
-      </w:rPr>
-      <w:t xml:space="preserve">ADDENDUM TO </w:t>
-    </w:r>
-  </w:p>
-  <w:p>
-    <w:pPr>
-      <w:spacing w:after="0"/>
-      <w:jc w:val="center"/>
-      <w:rPr>
-        <w:rFonts w:ascii="Helvetica" w:hAnsi="Helvetica" w:cs="Times New Roman"/>
-        <w:sz w:val="20"/>
-        <w:szCs w:val="20"/>
-      </w:rPr>
-    </w:pPr>
-    <w:r>
-      <w:rPr>
-        <w:rFonts w:ascii="Helvetica" w:hAnsi="Helvetica" w:cs="Times New Roman"/>
-        <w:sz w:val="20"/>
-        <w:szCs w:val="20"/>
-      </w:rPr>
-      <w:t>UNIFORM CHILD SUPPORT ORDER</w:t>
-    </w:r>
-  </w:p>
-  <w:p>
-    <w:pPr>
-      <w:suppressAutoHyphens w:val="0"/>
-      <w:spacing w:after="0"/>
-      <w:jc w:val="center"/>
-    </w:pPr>
-    <w:r>
-      <w:rPr>
-        <w:rFonts w:ascii="Helvetica" w:hAnsi="Helvetica" w:cs="Times New Roman"/>
+        <w:rFonts w:ascii="Arial" w:hAnsi="Arial" w:cs="Arial"/>
         <w:sz w:val="20"/>
         <w:szCs w:val="20"/>
       </w:rPr>
       <w:t xml:space="preserve">Page </w:t>
     </w:r>
     <w:r>
+      <w:rPr>
+        <w:rFonts w:ascii="Arial" w:hAnsi="Arial" w:cs="Arial"/>
+        <w:sz w:val="20"/>
+        <w:szCs w:val="20"/>
+      </w:rPr>
       <w:fldChar w:fldCharType="begin"/>
     </w:r>
     <w:r>
-      <w:instrText xml:space="preserve"> PAGE   \* MERGEFORMAT </w:instrText>
+      <w:rPr>
+        <w:rFonts w:ascii="Arial" w:hAnsi="Arial" w:cs="Arial"/>
+        <w:sz w:val="20"/>
+        <w:szCs w:val="20"/>
+      </w:rPr>
+      <w:instrText xml:space="preserve"> PAGE  \* Arabic  \* MERGEFORMAT </w:instrText>
     </w:r>
     <w:r>
+      <w:rPr>
+        <w:rFonts w:ascii="Arial" w:hAnsi="Arial" w:cs="Arial"/>
+        <w:sz w:val="20"/>
+        <w:szCs w:val="20"/>
+      </w:rPr>
       <w:fldChar w:fldCharType="separate"/>
     </w:r>
     <w:r>
       <w:rPr>
+        <w:rFonts w:ascii="Arial" w:hAnsi="Arial" w:cs="Arial"/>
         <w:noProof/>
+        <w:sz w:val="20"/>
+        <w:szCs w:val="20"/>
       </w:rPr>
-      <w:t>1</w:t>
+      <w:t>2</w:t>
     </w:r>
     <w:r>
       <w:rPr>
-        <w:noProof/>
+        <w:rFonts w:ascii="Arial" w:hAnsi="Arial" w:cs="Arial"/>
+        <w:sz w:val="20"/>
+        <w:szCs w:val="20"/>
       </w:rPr>
       <w:fldChar w:fldCharType="end"/>
     </w:r>
@@ -503,6 +660,7 @@
               <w:szCs w:val="20"/>
             </w:rPr>
           </w:pPr>
+          <w:proofErr w:type="gramStart"/>
           <w:r>
             <w:rPr>
               <w:b/>
@@ -513,6 +671,7 @@
             </w:rPr>
             <w:t xml:space="preserve">{{ </w:t>
           </w:r>
+          <w:proofErr w:type="spellStart"/>
           <w:r>
             <w:rPr>
               <w:b/>
@@ -529,8 +688,30 @@
               <w:sz w:val="20"/>
               <w:szCs w:val="20"/>
             </w:rPr>
-            <w:t>he_court.number</w:t>
-          </w:r>
+            <w:t>he</w:t>
+          </w:r>
+          <w:proofErr w:type="gramEnd"/>
+          <w:r>
+            <w:rPr>
+              <w:b/>
+              <w:bCs/>
+              <w:sz w:val="20"/>
+              <w:szCs w:val="20"/>
+            </w:rPr>
+            <w:t>_</w:t>
+          </w:r>
+          <w:proofErr w:type="gramStart"/>
+          <w:r>
+            <w:rPr>
+              <w:b/>
+              <w:bCs/>
+              <w:sz w:val="20"/>
+              <w:szCs w:val="20"/>
+            </w:rPr>
+            <w:t>court.number</w:t>
+          </w:r>
+          <w:proofErr w:type="spellEnd"/>
+          <w:proofErr w:type="gramEnd"/>
           <w:r>
             <w:rPr>
               <w:b/>
@@ -562,6 +743,7 @@
               <w:szCs w:val="20"/>
             </w:rPr>
           </w:pPr>
+          <w:proofErr w:type="gramStart"/>
           <w:r>
             <w:rPr>
               <w:b/>
@@ -572,14 +754,56 @@
             </w:rPr>
             <w:t xml:space="preserve">{{ </w:t>
           </w:r>
-          <w:r>
-            <w:rPr>
-              <w:b/>
-              <w:bCs/>
-              <w:sz w:val="20"/>
-              <w:szCs w:val="20"/>
-            </w:rPr>
-            <w:t>county_choice.upper()</w:t>
+          <w:proofErr w:type="spellStart"/>
+          <w:r>
+            <w:rPr>
+              <w:b/>
+              <w:bCs/>
+              <w:sz w:val="20"/>
+              <w:szCs w:val="20"/>
+            </w:rPr>
+            <w:t>county</w:t>
+          </w:r>
+          <w:proofErr w:type="gramEnd"/>
+          <w:r>
+            <w:rPr>
+              <w:b/>
+              <w:bCs/>
+              <w:sz w:val="20"/>
+              <w:szCs w:val="20"/>
+            </w:rPr>
+            <w:t>_</w:t>
+          </w:r>
+          <w:proofErr w:type="gramStart"/>
+          <w:r>
+            <w:rPr>
+              <w:b/>
+              <w:bCs/>
+              <w:sz w:val="20"/>
+              <w:szCs w:val="20"/>
+            </w:rPr>
+            <w:t>choice.upper</w:t>
+          </w:r>
+          <w:proofErr w:type="spellEnd"/>
+          <w:proofErr w:type="gramEnd"/>
+          <w:r>
+            <w:rPr>
+              <w:b/>
+              <w:bCs/>
+              <w:sz w:val="20"/>
+              <w:szCs w:val="20"/>
+            </w:rPr>
+            <w:t>(</w:t>
+          </w:r>
+          <w:proofErr w:type="gramStart"/>
+          <w:r>
+            <w:rPr>
+              <w:b/>
+              <w:bCs/>
+              <w:sz w:val="20"/>
+              <w:szCs w:val="20"/>
+            </w:rPr>
+            <w:t>)</w:t>
           </w:r>
           <w:r>
             <w:rPr>
@@ -589,7 +813,18 @@
               <w:sz w:val="20"/>
               <w:szCs w:val="20"/>
             </w:rPr>
-            <w:t xml:space="preserve"> }}</w:t>
+            <w:t xml:space="preserve"> }</w:t>
+          </w:r>
+          <w:proofErr w:type="gramEnd"/>
+          <w:r>
+            <w:rPr>
+              <w:b/>
+              <w:bCs/>
+              <w:caps/>
+              <w:sz w:val="20"/>
+              <w:szCs w:val="20"/>
+            </w:rPr>
+            <w:t>}</w:t>
           </w:r>
           <w:r>
             <w:rPr>
@@ -806,6 +1041,7 @@
               <w:szCs w:val="20"/>
             </w:rPr>
           </w:pPr>
+          <w:proofErr w:type="gramStart"/>
           <w:r>
             <w:rPr>
               <w:b/>
@@ -815,15 +1051,17 @@
             </w:rPr>
             <w:t xml:space="preserve">{{ </w:t>
           </w:r>
-          <w:r>
-            <w:rPr>
-              <w:b/>
-              <w:bCs/>
-              <w:sz w:val="20"/>
-              <w:szCs w:val="20"/>
-            </w:rPr>
-            <w:t>case</w:t>
-          </w:r>
+          <w:proofErr w:type="spellStart"/>
+          <w:r>
+            <w:rPr>
+              <w:b/>
+              <w:bCs/>
+              <w:sz w:val="20"/>
+              <w:szCs w:val="20"/>
+            </w:rPr>
+            <w:t>docket</w:t>
+          </w:r>
+          <w:proofErr w:type="gramEnd"/>
           <w:r>
             <w:rPr>
               <w:b/>
@@ -833,15 +1071,7 @@
             </w:rPr>
             <w:t>_number</w:t>
           </w:r>
-          <w:r>
-            <w:rPr>
-              <w:b/>
-              <w:bCs/>
-              <w:sz w:val="20"/>
-              <w:szCs w:val="20"/>
-            </w:rPr>
-            <w:t>_1</w:t>
-          </w:r>
+          <w:proofErr w:type="spellEnd"/>
           <w:r>
             <w:rPr>
               <w:b/>
@@ -933,8 +1163,37 @@
           <w:pPr>
             <w:pStyle w:val="Header"/>
           </w:pPr>
-          <w:r>
-            <w:t>{{ the_court.address.on_one_line() }}</w:t>
+          <w:proofErr w:type="gramStart"/>
+          <w:r>
+            <w:t xml:space="preserve">{{ </w:t>
+          </w:r>
+          <w:proofErr w:type="spellStart"/>
+          <w:r>
+            <w:t>the</w:t>
+          </w:r>
+          <w:proofErr w:type="gramEnd"/>
+          <w:r>
+            <w:t>_</w:t>
+          </w:r>
+          <w:proofErr w:type="gramStart"/>
+          <w:r>
+            <w:t>court.address</w:t>
+          </w:r>
+          <w:proofErr w:type="gramEnd"/>
+          <w:r>
+            <w:t>.on_one_</w:t>
+          </w:r>
+          <w:proofErr w:type="gramStart"/>
+          <w:r>
+            <w:t>line</w:t>
+          </w:r>
+          <w:proofErr w:type="spellEnd"/>
+          <w:r>
+            <w:t>(</w:t>
+          </w:r>
+          <w:proofErr w:type="gramEnd"/>
+          <w:r>
+            <w:t>) }}</w:t>
           </w:r>
         </w:p>
       </w:tc>
@@ -958,8 +1217,26 @@
             </w:tabs>
             <w:jc w:val="right"/>
           </w:pPr>
-          <w:r>
-            <w:t>{{ the_court.phone }}</w:t>
+          <w:proofErr w:type="gramStart"/>
+          <w:r>
+            <w:t xml:space="preserve">{{ </w:t>
+          </w:r>
+          <w:proofErr w:type="spellStart"/>
+          <w:r>
+            <w:t>the</w:t>
+          </w:r>
+          <w:proofErr w:type="gramEnd"/>
+          <w:r>
+            <w:t>_</w:t>
+          </w:r>
+          <w:proofErr w:type="gramStart"/>
+          <w:r>
+            <w:t>court.phone</w:t>
+          </w:r>
+          <w:proofErr w:type="spellEnd"/>
+          <w:proofErr w:type="gramEnd"/>
+          <w:r>
+            <w:t xml:space="preserve"> }}</w:t>
           </w:r>
         </w:p>
       </w:tc>

</xml_diff>